<commit_message>
Use regular text for government agency names
</commit_message>
<xml_diff>
--- a/บัญชีลงเวลา-พนักงานราช.docx
+++ b/บัญชีลงเวลา-พนักงานราช.docx
@@ -211,8 +211,6 @@
       <w:r>
         <w:rPr>
           <w:rFonts w:ascii="TH SarabunPSK" w:hAnsi="TH SarabunPSK" w:cs="TH SarabunPSK" w:hint="cs"/>
-          <w:b/>
-          <w:bCs/>
           <w:sz w:val="32"/>
           <w:szCs w:val="32"/>
           <w:u w:val="dotted"/>
@@ -259,8 +257,6 @@
       <w:r>
         <w:rPr>
           <w:rFonts w:ascii="TH SarabunPSK" w:hAnsi="TH SarabunPSK" w:cs="TH SarabunPSK" w:hint="cs"/>
-          <w:b/>
-          <w:bCs/>
           <w:sz w:val="32"/>
           <w:szCs w:val="32"/>
           <w:u w:val="dotted"/>
@@ -1954,8 +1950,6 @@
       <w:r>
         <w:rPr>
           <w:rFonts w:ascii="TH SarabunPSK" w:hAnsi="TH SarabunPSK" w:cs="TH SarabunPSK" w:hint="cs"/>
-          <w:b/>
-          <w:bCs/>
           <w:sz w:val="32"/>
           <w:szCs w:val="32"/>
           <w:u w:val="dotted"/>
@@ -1990,8 +1984,6 @@
       <w:r>
         <w:rPr>
           <w:rFonts w:ascii="TH SarabunPSK" w:hAnsi="TH SarabunPSK" w:cs="TH SarabunPSK" w:hint="cs"/>
-          <w:b/>
-          <w:bCs/>
           <w:sz w:val="32"/>
           <w:szCs w:val="32"/>
           <w:u w:val="dotted"/>

</xml_diff>